<commit_message>
release: NORAY OS v1.0.0 (RC1) Production Hardening & Certification
</commit_message>
<xml_diff>
--- a/cv/CV_google.docx
+++ b/cv/CV_google.docx
@@ -27,7 +27,7 @@
           <w:color w:val="6B7280"/>
           <w:sz w:val="24"/>
         </w:rPr>
-        <w:t>ML Engineer — Tailored for Google</w:t>
+        <w:t>Machine Learning  — Tailored for Google</w:t>
       </w:r>
     </w:p>
     <w:p>
@@ -64,7 +64,7 @@
           <w:rFonts w:ascii="Calibri" w:hAnsi="Calibri"/>
           <w:sz w:val="21"/>
         </w:rPr>
-        <w:t>Results-driven ML Engineer with proven expertise in Machine Learning, Agentic RAG architectures, and scalable AI systems development. Demonstrates strong technical foundation tailored for Google, combining mathematical rigor with hands-on full-stack engineering.</w:t>
+        <w:t>Results-driven Machine Learning  with proven expertise in Machine Learning, Agentic RAG architectures, and scalable AI systems development. Demonstrates strong technical foundation tailored for Google, combining mathematical rigor with hands-on full-stack engineering.</w:t>
       </w:r>
     </w:p>
     <w:p>

</xml_diff>